<commit_message>
Signal teaser: restore the 'Introducing' launch opener
The launch branch is gated on SIGNAL_FREE (still true), so the first-issue
announcement framing is correct: 'Introducing the Levanter Signal... Here is
the first Signal in one minute.'

Co-Authored-By: Claude Opus 4.8 <noreply@anthropic.com>
</commit_message>
<xml_diff>
--- a/reports/signals/docx/levanter-signal-teaser-2026-08-24.docx
+++ b/reports/signals/docx/levanter-signal-teaser-2026-08-24.docx
@@ -4,7 +4,7 @@
   <w:body>
     <w:p>
       <w:r>
-        <w:t>The Levanter Signal, our weekly subscriber note.</w:t>
+        <w:t>Introducing the Levanter Signal, our new weekly newsletter.</w:t>
       </w:r>
     </w:p>
     <w:p>
@@ -19,7 +19,7 @@
     </w:p>
     <w:p>
       <w:r>
-        <w:t>Here is this week's Signal in one minute.</w:t>
+        <w:t>Here is the first Signal in one minute.</w:t>
       </w:r>
     </w:p>
     <w:p>

</xml_diff>